<commit_message>
Completed DSI Bootcamp!! (resume update)
</commit_message>
<xml_diff>
--- a/docs/antonia_iaquinta_resume.docx
+++ b/docs/antonia_iaquinta_resume.docx
@@ -99,11 +99,16 @@
       <w:r>
         <w:t xml:space="preserve">andas, </w:t>
       </w:r>
+      <w:proofErr w:type="spellStart"/>
       <w:r>
         <w:t>N</w:t>
       </w:r>
       <w:r>
-        <w:t xml:space="preserve">umpy, </w:t>
+        <w:t>umpy</w:t>
+      </w:r>
+      <w:proofErr w:type="spellEnd"/>
+      <w:r>
+        <w:t xml:space="preserve">, </w:t>
       </w:r>
       <w:r>
         <w:t>M</w:t>
@@ -111,12 +116,14 @@
       <w:r>
         <w:t xml:space="preserve">atplotlib, </w:t>
       </w:r>
+      <w:proofErr w:type="spellStart"/>
       <w:r>
         <w:t>S</w:t>
       </w:r>
       <w:r>
         <w:t>tatsmodels</w:t>
       </w:r>
+      <w:proofErr w:type="spellEnd"/>
       <w:r>
         <w:t>,</w:t>
       </w:r>
@@ -1047,6 +1054,9 @@
         <w:t xml:space="preserve">Data Science Infinity Certification </w:t>
       </w:r>
       <w:r>
+        <w:t xml:space="preserve">/ Bootcamp </w:t>
+      </w:r>
+      <w:r>
         <w:t>|</w:t>
       </w:r>
       <w:r>
@@ -1065,7 +1075,7 @@
         <w:t xml:space="preserve"> – </w:t>
       </w:r>
       <w:r>
-        <w:t>present</w:t>
+        <w:t>October 2026</w:t>
       </w:r>
     </w:p>
     <w:p>

</xml_diff>